<commit_message>
The user manual drops the five figures it never had a screenshot for
Figures 3 to 7 carried "[ IMAGE N - screenshot to be added ]" instead of
a picture. All fourteen screenshots taken were already placed -- eleven
in the administrator's manual, three here -- so there was nothing left
to fill them with, and a shipped document should not read like a draft.

The whole figure box goes, caption and shaded table with it: a caption
pointing at nothing is no better than the placeholder. Figure 8 becomes
Figure 3 so the sequence still runs 1, 2, 3; no body text refers to a
figure by number, so nothing else moved. Old Figure 5 sat wedged between
two tables with no paragraph between them, so a paragraph takes its
place -- Word merges tables that touch.

The PDF beside it is untouched and still shows the placeholders.
</commit_message>
<xml_diff>
--- a/Documents/App document/369 Showroom Check - User Manual.docx
+++ b/Documents/App document/369 Showroom Check - User Manual.docx
@@ -2006,67 +2006,6 @@
       <w:tr>
         <w:tc>
           <w:tcPr>
-            <w:shd w:val="clear" w:color="auto" w:fill="F7F9FC"/>
-            <w:tcW w:w="6624" w:type="dxa"/>
-          </w:tcPr>
-          <w:p>
-            <w:pPr>
-              <w:spacing w:before="120"/>
-              <w:jc w:val="center"/>
-            </w:pPr>
-            <w:r/>
-            <w:r>
-              <w:rPr>
-                <w:b/>
-                <w:color w:val="2E74B5"/>
-                <w:sz w:val="20"/>
-              </w:rPr>
-              <w:t>[ IMAGE 3  -  screenshot to be added ]</w:t>
-            </w:r>
-          </w:p>
-          <w:p>
-            <w:pPr>
-              <w:spacing w:after="120"/>
-              <w:jc w:val="center"/>
-            </w:pPr>
-            <w:r>
-              <w:rPr>
-                <w:i/>
-                <w:color w:val="595959"/>
-                <w:sz w:val="18"/>
-              </w:rPr>
-              <w:t>Figure 3. The ready screen, showing the Photos / Video switch above the main button.</w:t>
-            </w:r>
-          </w:p>
-        </w:tc>
-      </w:tr>
-    </w:tbl>
-    <w:p>
-      <w:pPr>
-        <w:spacing w:after="40"/>
-      </w:pPr>
-    </w:p>
-    <w:tbl>
-      <w:tblPr>
-        <w:tblW w:type="auto" w:w="0"/>
-        <w:jc w:val="center"/>
-        <w:tblLayout w:type="fixed"/>
-        <w:tblLook w:firstColumn="1" w:firstRow="1" w:lastColumn="0" w:lastRow="0" w:noHBand="0" w:noVBand="1" w:val="04A0"/>
-        <w:tblBorders>
-          <w:top w:val="none" w:sz="0" w:space="0" w:color="auto"/>
-          <w:left w:val="none" w:sz="0" w:space="0" w:color="auto"/>
-          <w:bottom w:val="none" w:sz="0" w:space="0" w:color="auto"/>
-          <w:right w:val="none" w:sz="0" w:space="0" w:color="auto"/>
-          <w:insideH w:val="none" w:sz="0" w:space="0" w:color="auto"/>
-          <w:insideV w:val="none" w:sz="0" w:space="0" w:color="auto"/>
-        </w:tblBorders>
-      </w:tblPr>
-      <w:tblGrid>
-        <w:gridCol w:w="9360"/>
-      </w:tblGrid>
-      <w:tr>
-        <w:tc>
-          <w:tcPr>
             <w:shd w:val="clear" w:color="auto" w:fill="FFF8E7"/>
             <w:tcW w:w="9360" w:type="dxa"/>
           </w:tcPr>
@@ -2498,67 +2437,6 @@
                 <w:sz w:val="20"/>
               </w:rPr>
               <w:t>Your phone has no motion sensor. The round still works - just cover every wall yourself.</w:t>
-            </w:r>
-          </w:p>
-        </w:tc>
-      </w:tr>
-    </w:tbl>
-    <w:p>
-      <w:pPr>
-        <w:spacing w:after="40"/>
-      </w:pPr>
-    </w:p>
-    <w:tbl>
-      <w:tblPr>
-        <w:tblW w:type="auto" w:w="0"/>
-        <w:jc w:val="center"/>
-        <w:tblLayout w:type="fixed"/>
-        <w:tblLook w:firstColumn="1" w:firstRow="1" w:lastColumn="0" w:lastRow="0" w:noHBand="0" w:noVBand="1" w:val="04A0"/>
-        <w:tblBorders>
-          <w:top w:val="none" w:sz="0" w:space="0" w:color="auto"/>
-          <w:left w:val="none" w:sz="0" w:space="0" w:color="auto"/>
-          <w:bottom w:val="none" w:sz="0" w:space="0" w:color="auto"/>
-          <w:right w:val="none" w:sz="0" w:space="0" w:color="auto"/>
-          <w:insideH w:val="none" w:sz="0" w:space="0" w:color="auto"/>
-          <w:insideV w:val="none" w:sz="0" w:space="0" w:color="auto"/>
-        </w:tblBorders>
-      </w:tblPr>
-      <w:tblGrid>
-        <w:gridCol w:w="9360"/>
-      </w:tblGrid>
-      <w:tr>
-        <w:tc>
-          <w:tcPr>
-            <w:shd w:val="clear" w:color="auto" w:fill="F7F9FC"/>
-            <w:tcW w:w="6624" w:type="dxa"/>
-          </w:tcPr>
-          <w:p>
-            <w:pPr>
-              <w:spacing w:before="120"/>
-              <w:jc w:val="center"/>
-            </w:pPr>
-            <w:r/>
-            <w:r>
-              <w:rPr>
-                <w:b/>
-                <w:color w:val="2E74B5"/>
-                <w:sz w:val="20"/>
-              </w:rPr>
-              <w:t>[ IMAGE 4  -  screenshot to be added ]</w:t>
-            </w:r>
-          </w:p>
-          <w:p>
-            <w:pPr>
-              <w:spacing w:after="120"/>
-              <w:jc w:val="center"/>
-            </w:pPr>
-            <w:r>
-              <w:rPr>
-                <w:i/>
-                <w:color w:val="595959"/>
-                <w:sz w:val="18"/>
-              </w:rPr>
-              <w:t>Figure 4. Recording in progress, with the timer, the progress bar, the view chips and the Stop button.</w:t>
             </w:r>
           </w:p>
         </w:tc>
@@ -3046,62 +2924,7 @@
         </w:tc>
       </w:tr>
     </w:tbl>
-    <w:tbl>
-      <w:tblPr>
-        <w:tblW w:type="auto" w:w="0"/>
-        <w:jc w:val="center"/>
-        <w:tblLayout w:type="fixed"/>
-        <w:tblLook w:firstColumn="1" w:firstRow="1" w:lastColumn="0" w:lastRow="0" w:noHBand="0" w:noVBand="1" w:val="04A0"/>
-        <w:tblBorders>
-          <w:top w:val="none" w:sz="0" w:space="0" w:color="auto"/>
-          <w:left w:val="none" w:sz="0" w:space="0" w:color="auto"/>
-          <w:bottom w:val="none" w:sz="0" w:space="0" w:color="auto"/>
-          <w:right w:val="none" w:sz="0" w:space="0" w:color="auto"/>
-          <w:insideH w:val="none" w:sz="0" w:space="0" w:color="auto"/>
-          <w:insideV w:val="none" w:sz="0" w:space="0" w:color="auto"/>
-        </w:tblBorders>
-      </w:tblPr>
-      <w:tblGrid>
-        <w:gridCol w:w="9360"/>
-      </w:tblGrid>
-      <w:tr>
-        <w:tc>
-          <w:tcPr>
-            <w:shd w:val="clear" w:color="auto" w:fill="F7F9FC"/>
-            <w:tcW w:w="6624" w:type="dxa"/>
-          </w:tcPr>
-          <w:p>
-            <w:pPr>
-              <w:spacing w:before="120"/>
-              <w:jc w:val="center"/>
-            </w:pPr>
-            <w:r/>
-            <w:r>
-              <w:rPr>
-                <w:b/>
-                <w:color w:val="2E74B5"/>
-                <w:sz w:val="20"/>
-              </w:rPr>
-              <w:t>[ IMAGE 5  -  screenshot to be added ]</w:t>
-            </w:r>
-          </w:p>
-          <w:p>
-            <w:pPr>
-              <w:spacing w:after="120"/>
-              <w:jc w:val="center"/>
-            </w:pPr>
-            <w:r>
-              <w:rPr>
-                <w:i/>
-                <w:color w:val="595959"/>
-                <w:sz w:val="18"/>
-              </w:rPr>
-              <w:t>Figure 5. The review screen, showing the clip playing back with the view names underneath.</w:t>
-            </w:r>
-          </w:p>
-        </w:tc>
-      </w:tr>
-    </w:tbl>
+    <w:p/>
     <w:tbl>
       <w:tblPr>
         <w:tblW w:type="auto" w:w="0"/>
@@ -3592,67 +3415,6 @@
       <w:tr>
         <w:tc>
           <w:tcPr>
-            <w:shd w:val="clear" w:color="auto" w:fill="F7F9FC"/>
-            <w:tcW w:w="6624" w:type="dxa"/>
-          </w:tcPr>
-          <w:p>
-            <w:pPr>
-              <w:spacing w:before="120"/>
-              <w:jc w:val="center"/>
-            </w:pPr>
-            <w:r/>
-            <w:r>
-              <w:rPr>
-                <w:b/>
-                <w:color w:val="2E74B5"/>
-                <w:sz w:val="20"/>
-              </w:rPr>
-              <w:t>[ IMAGE 6  -  screenshot to be added ]</w:t>
-            </w:r>
-          </w:p>
-          <w:p>
-            <w:pPr>
-              <w:spacing w:after="120"/>
-              <w:jc w:val="center"/>
-            </w:pPr>
-            <w:r>
-              <w:rPr>
-                <w:i/>
-                <w:color w:val="595959"/>
-                <w:sz w:val="18"/>
-              </w:rPr>
-              <w:t>Figure 6. A direction step, showing the arrow, the turn meter, the original button and the shutter.</w:t>
-            </w:r>
-          </w:p>
-        </w:tc>
-      </w:tr>
-    </w:tbl>
-    <w:p>
-      <w:pPr>
-        <w:spacing w:after="40"/>
-      </w:pPr>
-    </w:p>
-    <w:tbl>
-      <w:tblPr>
-        <w:tblW w:type="auto" w:w="0"/>
-        <w:jc w:val="center"/>
-        <w:tblLayout w:type="fixed"/>
-        <w:tblLook w:firstColumn="1" w:firstRow="1" w:lastColumn="0" w:lastRow="0" w:noHBand="0" w:noVBand="1" w:val="04A0"/>
-        <w:tblBorders>
-          <w:top w:val="none" w:sz="0" w:space="0" w:color="auto"/>
-          <w:left w:val="none" w:sz="0" w:space="0" w:color="auto"/>
-          <w:bottom w:val="none" w:sz="0" w:space="0" w:color="auto"/>
-          <w:right w:val="none" w:sz="0" w:space="0" w:color="auto"/>
-          <w:insideH w:val="none" w:sz="0" w:space="0" w:color="auto"/>
-          <w:insideV w:val="none" w:sz="0" w:space="0" w:color="auto"/>
-        </w:tblBorders>
-      </w:tblPr>
-      <w:tblGrid>
-        <w:gridCol w:w="9360"/>
-      </w:tblGrid>
-      <w:tr>
-        <w:tc>
-          <w:tcPr>
             <w:shd w:val="clear" w:color="auto" w:fill="FFF8E7"/>
             <w:tcW w:w="9360" w:type="dxa"/>
           </w:tcPr>
@@ -3991,67 +3753,6 @@
                 <w:sz w:val="20"/>
               </w:rPr>
               <w:t>.</w:t>
-            </w:r>
-          </w:p>
-        </w:tc>
-      </w:tr>
-    </w:tbl>
-    <w:p>
-      <w:pPr>
-        <w:spacing w:after="40"/>
-      </w:pPr>
-    </w:p>
-    <w:tbl>
-      <w:tblPr>
-        <w:tblW w:type="auto" w:w="0"/>
-        <w:jc w:val="center"/>
-        <w:tblLayout w:type="fixed"/>
-        <w:tblLook w:firstColumn="1" w:firstRow="1" w:lastColumn="0" w:lastRow="0" w:noHBand="0" w:noVBand="1" w:val="04A0"/>
-        <w:tblBorders>
-          <w:top w:val="none" w:sz="0" w:space="0" w:color="auto"/>
-          <w:left w:val="none" w:sz="0" w:space="0" w:color="auto"/>
-          <w:bottom w:val="none" w:sz="0" w:space="0" w:color="auto"/>
-          <w:right w:val="none" w:sz="0" w:space="0" w:color="auto"/>
-          <w:insideH w:val="none" w:sz="0" w:space="0" w:color="auto"/>
-          <w:insideV w:val="none" w:sz="0" w:space="0" w:color="auto"/>
-        </w:tblBorders>
-      </w:tblPr>
-      <w:tblGrid>
-        <w:gridCol w:w="9360"/>
-      </w:tblGrid>
-      <w:tr>
-        <w:tc>
-          <w:tcPr>
-            <w:shd w:val="clear" w:color="auto" w:fill="F7F9FC"/>
-            <w:tcW w:w="6624" w:type="dxa"/>
-          </w:tcPr>
-          <w:p>
-            <w:pPr>
-              <w:spacing w:before="120"/>
-              <w:jc w:val="center"/>
-            </w:pPr>
-            <w:r/>
-            <w:r>
-              <w:rPr>
-                <w:b/>
-                <w:color w:val="2E74B5"/>
-                <w:sz w:val="20"/>
-              </w:rPr>
-              <w:t>[ IMAGE 7  -  screenshot to be added ]</w:t>
-            </w:r>
-          </w:p>
-          <w:p>
-            <w:pPr>
-              <w:spacing w:after="120"/>
-              <w:jc w:val="center"/>
-            </w:pPr>
-            <w:r>
-              <w:rPr>
-                <w:i/>
-                <w:color w:val="595959"/>
-                <w:sz w:val="18"/>
-              </w:rPr>
-              <w:t>Figure 7. The upload in progress, showing the Sending percentage and its bar.</w:t>
             </w:r>
           </w:p>
         </w:tc>
@@ -5004,7 +4705,7 @@
                 <w:color w:val="595959"/>
                 <w:sz w:val="18"/>
               </w:rPr>
-              <w:t>Figure 8. The Profile tab, showing the access badge, the language switch and the account details.</w:t>
+              <w:t>Figure 3. The Profile tab, showing the access badge, the language switch and the account details.</w:t>
             </w:r>
           </w:p>
         </w:tc>

</xml_diff>